<commit_message>
Client note: add Discount Approval Note (PDF form) section
Describe the system-generated Discount Approval Note, its L1-L6 signature
trail, and where it is produced (on demand from YRVG052 and automatically
at L6 disbursement).

Co-Authored-By: Claude Opus 4.8 <noreply@anthropic.com>
Claude-Session: https://claude.ai/code/session_01A3BJ7ydDq6e8VDbD1uvXUk
</commit_message>
<xml_diff>
--- a/CIS_2026-27_6Level_Workflow_Client_Note.docx
+++ b/CIS_2026-27_6Level_Workflow_Client_Note.docx
@@ -1877,7 +1877,118 @@
           <w:bCs/>
           <w:color w:val="1F3864"/>
         </w:rPr>
-        <w:t xml:space="preserve">7.  Points to note</w:t>
+        <w:t xml:space="preserve">7.  Discount Approval Note (system-generated PDF)</w:t>
+      </w:r>
+    </w:p>
+    <w:p>
+      <w:pPr>
+        <w:spacing w:after="120" w:before="0"/>
+      </w:pPr>
+      <w:r>
+        <w:rPr>
+          <w:color w:val="262626"/>
+          <w:sz w:val="22"/>
+          <w:szCs w:val="22"/>
+        </w:rPr>
+        <w:t xml:space="preserve">Along with the workflow, the system generates the Discount Approval Note as a PDF in the same format shared by GAIL (GAIL / Petrochemical Marketing Group header; Approval Note No., Reference No., Date; Subject / Variant; Background and Main Body; Discount total value; Approving Authority; and the L1 to L6 approval blocks). Each level's block carries the remarks entered at that level and the approver's digital signature, CPF number and time stamp, so the note is a complete, printable record of the approval trail.</w:t>
+      </w:r>
+    </w:p>
+    <w:p>
+      <w:pPr>
+        <w:pStyle w:val="ListParagraph"/>
+        <w:numPr>
+          <w:ilvl w:val="0"/>
+          <w:numId w:val="1"/>
+        </w:numPr>
+        <w:spacing w:after="70"/>
+      </w:pPr>
+      <w:r>
+        <w:rPr>
+          <w:b/>
+          <w:bCs/>
+          <w:color w:val="262626"/>
+          <w:sz w:val="22"/>
+          <w:szCs w:val="22"/>
+        </w:rPr>
+        <w:t xml:space="preserve">Where it is produced: </w:t>
+      </w:r>
+      <w:r>
+        <w:rPr>
+          <w:color w:val="262626"/>
+          <w:sz w:val="22"/>
+          <w:szCs w:val="22"/>
+        </w:rPr>
+        <w:t xml:space="preserve">the note can be printed / viewed on demand from the report (YRVG052) for any CIS record, and is produced automatically when the discount is disbursed at L6 - at which point all six levels' signatures and time stamps are available.</w:t>
+      </w:r>
+    </w:p>
+    <w:p>
+      <w:pPr>
+        <w:pStyle w:val="ListParagraph"/>
+        <w:numPr>
+          <w:ilvl w:val="0"/>
+          <w:numId w:val="1"/>
+        </w:numPr>
+        <w:spacing w:after="70"/>
+      </w:pPr>
+      <w:r>
+        <w:rPr>
+          <w:b/>
+          <w:bCs/>
+          <w:color w:val="262626"/>
+          <w:sz w:val="22"/>
+          <w:szCs w:val="22"/>
+        </w:rPr>
+        <w:t xml:space="preserve">What fills it: </w:t>
+      </w:r>
+      <w:r>
+        <w:rPr>
+          <w:color w:val="262626"/>
+          <w:sz w:val="22"/>
+          <w:szCs w:val="22"/>
+        </w:rPr>
+        <w:t xml:space="preserve">the figures and the L1 to L6 signature lines are taken directly from the approval record (customer, variant, total discount value, and each level's user, date, time and remarks) - nothing is keyed in manually.</w:t>
+      </w:r>
+    </w:p>
+    <w:p>
+      <w:pPr>
+        <w:pStyle w:val="ListParagraph"/>
+        <w:numPr>
+          <w:ilvl w:val="0"/>
+          <w:numId w:val="1"/>
+        </w:numPr>
+        <w:spacing w:after="70"/>
+      </w:pPr>
+      <w:r>
+        <w:rPr>
+          <w:b/>
+          <w:bCs/>
+          <w:color w:val="262626"/>
+          <w:sz w:val="22"/>
+          <w:szCs w:val="22"/>
+        </w:rPr>
+        <w:t xml:space="preserve">Technical objects (for reference): </w:t>
+      </w:r>
+      <w:r>
+        <w:rPr>
+          <w:color w:val="262626"/>
+          <w:sz w:val="22"/>
+          <w:szCs w:val="22"/>
+        </w:rPr>
+        <w:t xml:space="preserve">SAP Interactive Form (Adobe) ZCIS_PSD_APPR_NOTE with interface structure ZCIS_APPR_NOTE_S; rendered by a print driver from the CIS workflow.</w:t>
+      </w:r>
+    </w:p>
+    <w:p>
+      <w:pPr>
+        <w:pStyle w:val="Heading1"/>
+        <w:spacing w:after="110" w:before="240"/>
+      </w:pPr>
+      <w:r>
+        <w:rPr>
+          <w:b/>
+          <w:bCs/>
+          <w:color w:val="1F3864"/>
+        </w:rPr>
+        <w:t xml:space="preserve">8.  Points to note</w:t>
       </w:r>
     </w:p>
     <w:p>

</xml_diff>